<commit_message>
Add public Pages URL to README and Canvas submission
</commit_message>
<xml_diff>
--- a/Canvas_Submission.docx
+++ b/Canvas_Submission.docx
@@ -59,7 +59,7 @@
         <w:t xml:space="preserve">Public URL: </w:t>
       </w:r>
       <w:r>
-        <w:t xml:space="preserve">Pending deploy — see README deploy steps. Local playable URL while developing: http://127.0.0.1:43127</w:t>
+        <w:t xml:space="preserve">https://kimballjh11.github.io/kanye-taylor-connect4/</w:t>
       </w:r>
     </w:p>
     <w:p>
@@ -89,7 +89,7 @@
         <w:t xml:space="preserve">How to run locally: </w:t>
       </w:r>
       <w:r>
-        <w:t xml:space="preserve">cd into the folder above, run npm install, then npm run dev, and open http://127.0.0.1:43127. For a free public host, see the README (Netlify Drop / Vercel / GitHub Pages).</w:t>
+        <w:t xml:space="preserve">cd into the folder above, run npm install, then npm run dev, and open http://127.0.0.1:43127.</w:t>
       </w:r>
     </w:p>
     <w:p>

</xml_diff>